<commit_message>
feat(roadmap): integrate 7-day pilot matrix, guarantee banner and presentation links into ai-rop.ru
</commit_message>
<xml_diff>
--- a/docs/Дорожная_Карта_Пилота_Для_Клиента_7_Дней.docx
+++ b/docs/Дорожная_Карта_Пилота_Для_Клиента_7_Дней.docx
@@ -856,13 +856,7 @@
         <w:jc w:val="center"/>
       </w:pPr>
       <w:r>
-        <w:rPr>
-          <w:rFonts w:ascii="Arial" w:hAnsi="Arial"/>
-          <w:b/>
-          <w:color w:val="4F46E5"/>
-          <w:sz w:val="16"/>
-        </w:rPr>
-        <w:t>Веб-сайт: ai-rop.ru   •   Telegram для старта аудита: @Reflecteddark   •   Email: strelok15@bk.ru</w:t>
+        <w:t>Веб-сайт: ai-rop.ru   •   Telegram для старта аудита: @dm1918  •  Бот: @RevOps_Super_Audit_Bot   •   Email: strelok15@bk.ru</w:t>
       </w:r>
     </w:p>
     <w:sectPr>

</xml_diff>